<commit_message>
eval: 3x each format with images/tables/charts inside (pdf/docx/pptx/xlsx/csv/txt/md/png)
</commit_message>
<xml_diff>
--- a/eval/dataset/files/lab_notes.docx
+++ b/eval/dataset/files/lab_notes.docx
@@ -52,6 +52,226 @@
     <w:p>
       <w:r>
         <w:t>Connect battery positive to ammeter positive (red), ammeter negative to one end of the unknown resistor, the other end through the rheostat back to battery negative. Voltmeter goes in parallel across the resistor: red where current enters, black where it leaves. MARKER-WIRING-DOCX.</w:t>
+      </w:r>
+    </w:p>
+    <w:p>
+      <w:pPr>
+        <w:pStyle w:val="Heading2"/>
+      </w:pPr>
+      <w:r>
+        <w:t>Measured V-I pairs (R = 250 ohm)</w:t>
+      </w:r>
+    </w:p>
+    <w:tbl>
+      <w:tblPr>
+        <w:tblW w:type="auto" w:w="0"/>
+        <w:tblLook w:firstColumn="1" w:firstRow="1" w:lastColumn="0" w:lastRow="0" w:noHBand="0" w:noVBand="1" w:val="04A0"/>
+      </w:tblPr>
+      <w:tblGrid>
+        <w:gridCol w:w="2880"/>
+        <w:gridCol w:w="2880"/>
+        <w:gridCol w:w="2880"/>
+      </w:tblGrid>
+      <w:tr>
+        <w:tc>
+          <w:tcPr>
+            <w:tcW w:type="dxa" w:w="2880"/>
+          </w:tcPr>
+          <w:p>
+            <w:r>
+              <w:t>voltage_V</w:t>
+            </w:r>
+          </w:p>
+        </w:tc>
+        <w:tc>
+          <w:tcPr>
+            <w:tcW w:type="dxa" w:w="2880"/>
+          </w:tcPr>
+          <w:p>
+            <w:r>
+              <w:t>current_mA</w:t>
+            </w:r>
+          </w:p>
+        </w:tc>
+        <w:tc>
+          <w:tcPr>
+            <w:tcW w:type="dxa" w:w="2880"/>
+          </w:tcPr>
+          <w:p>
+            <w:r>
+              <w:t>resistance_ohm</w:t>
+            </w:r>
+          </w:p>
+        </w:tc>
+      </w:tr>
+      <w:tr>
+        <w:tc>
+          <w:tcPr>
+            <w:tcW w:type="dxa" w:w="2880"/>
+          </w:tcPr>
+          <w:p>
+            <w:r>
+              <w:t>3.0</w:t>
+            </w:r>
+          </w:p>
+        </w:tc>
+        <w:tc>
+          <w:tcPr>
+            <w:tcW w:type="dxa" w:w="2880"/>
+          </w:tcPr>
+          <w:p>
+            <w:r>
+              <w:t>12.0</w:t>
+            </w:r>
+          </w:p>
+        </w:tc>
+        <w:tc>
+          <w:tcPr>
+            <w:tcW w:type="dxa" w:w="2880"/>
+          </w:tcPr>
+          <w:p>
+            <w:r>
+              <w:t>250</w:t>
+            </w:r>
+          </w:p>
+        </w:tc>
+      </w:tr>
+      <w:tr>
+        <w:tc>
+          <w:tcPr>
+            <w:tcW w:type="dxa" w:w="2880"/>
+          </w:tcPr>
+          <w:p>
+            <w:r>
+              <w:t>6.0</w:t>
+            </w:r>
+          </w:p>
+        </w:tc>
+        <w:tc>
+          <w:tcPr>
+            <w:tcW w:type="dxa" w:w="2880"/>
+          </w:tcPr>
+          <w:p>
+            <w:r>
+              <w:t>24.0</w:t>
+            </w:r>
+          </w:p>
+        </w:tc>
+        <w:tc>
+          <w:tcPr>
+            <w:tcW w:type="dxa" w:w="2880"/>
+          </w:tcPr>
+          <w:p>
+            <w:r>
+              <w:t>250</w:t>
+            </w:r>
+          </w:p>
+        </w:tc>
+      </w:tr>
+      <w:tr>
+        <w:tc>
+          <w:tcPr>
+            <w:tcW w:type="dxa" w:w="2880"/>
+          </w:tcPr>
+          <w:p>
+            <w:r>
+              <w:t>9.0</w:t>
+            </w:r>
+          </w:p>
+        </w:tc>
+        <w:tc>
+          <w:tcPr>
+            <w:tcW w:type="dxa" w:w="2880"/>
+          </w:tcPr>
+          <w:p>
+            <w:r>
+              <w:t>36.0</w:t>
+            </w:r>
+          </w:p>
+        </w:tc>
+        <w:tc>
+          <w:tcPr>
+            <w:tcW w:type="dxa" w:w="2880"/>
+          </w:tcPr>
+          <w:p>
+            <w:r>
+              <w:t>250</w:t>
+            </w:r>
+          </w:p>
+        </w:tc>
+      </w:tr>
+      <w:tr>
+        <w:tc>
+          <w:tcPr>
+            <w:tcW w:type="dxa" w:w="2880"/>
+          </w:tcPr>
+          <w:p>
+            <w:r>
+              <w:t>12.0</w:t>
+            </w:r>
+          </w:p>
+        </w:tc>
+        <w:tc>
+          <w:tcPr>
+            <w:tcW w:type="dxa" w:w="2880"/>
+          </w:tcPr>
+          <w:p>
+            <w:r>
+              <w:t>48.0</w:t>
+            </w:r>
+          </w:p>
+        </w:tc>
+        <w:tc>
+          <w:tcPr>
+            <w:tcW w:type="dxa" w:w="2880"/>
+          </w:tcPr>
+          <w:p>
+            <w:r>
+              <w:t>250</w:t>
+            </w:r>
+          </w:p>
+        </w:tc>
+      </w:tr>
+    </w:tbl>
+    <w:p>
+      <w:r>
+        <w:t>Figure: the board circuit.</w:t>
+      </w:r>
+    </w:p>
+    <w:p>
+      <w:r>
+        <w:drawing>
+          <wp:inline xmlns:a="http://schemas.openxmlformats.org/drawingml/2006/main" xmlns:pic="http://schemas.openxmlformats.org/drawingml/2006/picture">
+            <wp:extent cx="5029200" cy="3017520"/>
+            <wp:docPr id="1" name="Picture 1"/>
+            <wp:cNvGraphicFramePr>
+              <a:graphicFrameLocks noChangeAspect="1"/>
+            </wp:cNvGraphicFramePr>
+            <a:graphic>
+              <a:graphicData uri="http://schemas.openxmlformats.org/drawingml/2006/picture">
+                <pic:pic>
+                  <pic:nvPicPr>
+                    <pic:cNvPr id="0" name="circuit_diagram.png"/>
+                    <pic:cNvPicPr/>
+                  </pic:nvPicPr>
+                  <pic:blipFill>
+                    <a:blip r:embed="rId9"/>
+                    <a:stretch>
+                      <a:fillRect/>
+                    </a:stretch>
+                  </pic:blipFill>
+                  <pic:spPr>
+                    <a:xfrm>
+                      <a:off x="0" y="0"/>
+                      <a:ext cx="5029200" cy="3017520"/>
+                    </a:xfrm>
+                    <a:prstGeom prst="rect"/>
+                  </pic:spPr>
+                </pic:pic>
+              </a:graphicData>
+            </a:graphic>
+          </wp:inline>
+        </w:drawing>
       </w:r>
     </w:p>
     <w:sectPr>

</xml_diff>

<commit_message>
eval: bulk up corpus (23-row tables, 20-run logs, dense annotated diagrams)
</commit_message>
<xml_diff>
--- a/eval/dataset/files/lab_notes.docx
+++ b/eval/dataset/files/lab_notes.docx
@@ -242,7 +242,7 @@
       <w:r>
         <w:drawing>
           <wp:inline xmlns:a="http://schemas.openxmlformats.org/drawingml/2006/main" xmlns:pic="http://schemas.openxmlformats.org/drawingml/2006/picture">
-            <wp:extent cx="5029200" cy="3017520"/>
+            <wp:extent cx="5029200" cy="3464560"/>
             <wp:docPr id="1" name="Picture 1"/>
             <wp:cNvGraphicFramePr>
               <a:graphicFrameLocks noChangeAspect="1"/>
@@ -263,7 +263,7 @@
                   <pic:spPr>
                     <a:xfrm>
                       <a:off x="0" y="0"/>
-                      <a:ext cx="5029200" cy="3017520"/>
+                      <a:ext cx="5029200" cy="3464560"/>
                     </a:xfrm>
                     <a:prstGeom prst="rect"/>
                   </pic:spPr>

</xml_diff>